<commit_message>
Add SFT-to-GRPO two-stage training design for accident detection
Co-authored-by: daffxx14526 <daffxx14526@users.noreply.github.com>
</commit_message>
<xml_diff>
--- a/docs_word/accident_detection_training_plan.docx
+++ b/docs_word/accident_detection_training_plan.docx
@@ -6470,6 +6470,79 @@
         <w:rPr>
           <w:rFonts w:ascii="Calibri" w:hAnsi="Calibri" w:eastAsia="Microsoft YaHei"/>
           <w:b w:val="0"/>
+          <w:i/>
+          <w:color w:val="555555"/>
+          <w:sz w:val="22"/>
+        </w:rPr>
+        <w:br/>
+      </w:r>
+      <w:r>
+        <w:rPr>
+          <w:rFonts w:ascii="Calibri" w:hAnsi="Calibri" w:eastAsia="Microsoft YaHei"/>
+          <w:b w:val="0"/>
+          <w:i/>
+          <w:color w:val="555555"/>
+          <w:sz w:val="22"/>
+        </w:rPr>
+        <w:t>完整的 SFT → GRPO 两阶段设计（数据筛选、多任务奖励路由、证据一致性奖励、非对称代价、</w:t>
+      </w:r>
+      <w:r>
+        <w:rPr>
+          <w:rFonts w:ascii="Calibri" w:hAnsi="Calibri" w:eastAsia="Microsoft YaHei"/>
+          <w:b w:val="0"/>
+          <w:i/>
+          <w:color w:val="555555"/>
+          <w:sz w:val="22"/>
+        </w:rPr>
+        <w:br/>
+      </w:r>
+      <w:r>
+        <w:rPr>
+          <w:rFonts w:ascii="Calibri" w:hAnsi="Calibri" w:eastAsia="Microsoft YaHei"/>
+          <w:b w:val="0"/>
+          <w:i/>
+          <w:color w:val="555555"/>
+          <w:sz w:val="22"/>
+        </w:rPr>
+        <w:br/>
+        <w:t xml:space="preserve">训练监控与部署蒸馏）见 </w:t>
+      </w:r>
+      <w:r>
+        <w:rPr>
+          <w:rFonts w:ascii="Consolas" w:hAnsi="Consolas" w:eastAsia="Microsoft YaHei"/>
+          <w:b w:val="0"/>
+          <w:i/>
+          <w:color w:val="555555"/>
+          <w:sz w:val="20"/>
+        </w:rPr>
+        <w:t>accident_sft_grpo_two_stage_training.md</w:t>
+      </w:r>
+      <w:r>
+        <w:rPr>
+          <w:rFonts w:ascii="Calibri" w:hAnsi="Calibri" w:eastAsia="Microsoft YaHei"/>
+          <w:b w:val="0"/>
+          <w:i/>
+          <w:color w:val="555555"/>
+          <w:sz w:val="22"/>
+        </w:rPr>
+        <w:t>，本节只保留概要。</w:t>
+      </w:r>
+      <w:r>
+        <w:rPr>
+          <w:rFonts w:ascii="Calibri" w:hAnsi="Calibri" w:eastAsia="Microsoft YaHei"/>
+          <w:b w:val="0"/>
+          <w:i/>
+          <w:color w:val="555555"/>
+          <w:sz w:val="22"/>
+        </w:rPr>
+        <w:br/>
+      </w:r>
+    </w:p>
+    <w:p>
+      <w:r>
+        <w:rPr>
+          <w:rFonts w:ascii="Calibri" w:hAnsi="Calibri" w:eastAsia="Microsoft YaHei"/>
+          <w:b w:val="0"/>
           <w:i w:val="0"/>
           <w:sz w:val="22"/>
         </w:rPr>
@@ -6992,7 +7065,7 @@
           <w:color w:val="222222"/>
           <w:sz w:val="18"/>
         </w:rPr>
-        <w:t>from swift.plugin import ORM, orms</w:t>
+        <w:t>from swift.rewards import ORM, orms  # 新版 ms-swift 路径；旧版为 swift.plugin</w:t>
       </w:r>
     </w:p>
     <w:p>

</xml_diff>